<commit_message>
feat: complete user access and support flow
</commit_message>
<xml_diff>
--- a/artifacts/manuale_utente_street_skate.docx
+++ b/artifacts/manuale_utente_street_skate.docx
@@ -78,7 +78,7 @@
                 <w:b w:val="0"/>
                 <w:sz w:val="21"/>
               </w:rPr>
-              <w:t>1.3</w:t>
+              <w:t>4.1</w:t>
             </w:r>
           </w:p>
         </w:tc>
@@ -121,7 +121,7 @@
                 <w:b w:val="0"/>
                 <w:sz w:val="21"/>
               </w:rPr>
-              <w:t>21/08/2026</w:t>
+              <w:t>16/09/2026</w:t>
             </w:r>
           </w:p>
         </w:tc>
@@ -170,7 +170,45 @@
         </w:tc>
       </w:tr>
     </w:tbl>
-    <w:p/>
+    <w:p>
+      <w:pPr>
+        <w:spacing w:before="280" w:after="120"/>
+      </w:pPr>
+      <w:r>
+        <w:rPr>
+          <w:rFonts w:ascii="Calibri" w:hAnsi="Calibri"/>
+          <w:b/>
+          <w:color w:val="163A63"/>
+          <w:sz w:val="32"/>
+        </w:rPr>
+        <w:t>Sommario</w:t>
+      </w:r>
+    </w:p>
+    <w:p>
+      <w:pPr>
+        <w:spacing w:after="120"/>
+      </w:pPr>
+      <w:r>
+        <w:fldChar w:fldCharType="begin"/>
+      </w:r>
+      <w:r>
+        <w:instrText xml:space="preserve"> TOC \o "1-3" \h \z \u </w:instrText>
+      </w:r>
+      <w:r>
+        <w:fldChar w:fldCharType="separate"/>
+      </w:r>
+      <w:r>
+        <w:t>Aggiornare il sommario in Word per visualizzare capitoli, sottoparagrafi e pagine.</w:t>
+      </w:r>
+      <w:r>
+        <w:fldChar w:fldCharType="end"/>
+      </w:r>
+    </w:p>
+    <w:p>
+      <w:r>
+        <w:br w:type="page"/>
+      </w:r>
+    </w:p>
     <w:p>
       <w:pPr>
         <w:pStyle w:val="Heading1"/>
@@ -623,6 +661,16 @@
       </w:r>
     </w:p>
     <w:p>
+      <w:r>
+        <w:t>La schermata di login usa ora il titolo Street Skate e adatta la disposizione dei blocchi in base al device: layout esteso per desktop/tablet e layout compatto verticale per smartphone.</w:t>
+      </w:r>
+    </w:p>
+    <w:p>
+      <w:r>
+        <w:t>Se l'utente non possiede ancora un account locale e non usa un provider sportivo supportato, la home espone anche il link Registrati per inviare una richiesta di attivazione all'admin.</w:t>
+      </w:r>
+    </w:p>
+    <w:p>
       <w:pPr>
         <w:pStyle w:val="Heading1"/>
       </w:pPr>
@@ -643,7 +691,15 @@
         <w:pStyle w:val="ListBullet"/>
       </w:pPr>
       <w:r>
-        <w:t>Strava: il pulsante apre la pagina ufficiale di login del provider; l'utente inserisce lì le credenziali e il backend completa l'autenticazione OAuth tramite callback e token API.</w:t>
+        <w:t>Strava: il pulsante apre la pagina ufficiale di login/autorizzazione del provider; l'utente inserisce lì le credenziali e il backend completa l'autenticazione OAuth tramite callback e token API.</w:t>
+      </w:r>
+    </w:p>
+    <w:p>
+      <w:pPr>
+        <w:pStyle w:val="ListBullet"/>
+      </w:pPr>
+      <w:r>
+        <w:t>Se nel browser è già aperta una sessione Strava, il provider può riutilizzarla e mostrare subito il consenso senza ripresentare il form credenziali. Per test con un altro account conviene usare logout da Strava, finestra anonima o profilo browser separato.</w:t>
       </w:r>
     </w:p>
     <w:p>
@@ -699,15 +755,23 @@
         <w:pStyle w:val="ListBullet"/>
       </w:pPr>
       <w:r>
+        <w:t>Sotto al form di accesso locale è presente il link Registrati: apre una pagina pubblica con nome, cognome, username, data di nascita, email e telefono, registrando una richiesta pendente per l'admin.</w:t>
+      </w:r>
+    </w:p>
+    <w:p>
+      <w:pPr>
+        <w:pStyle w:val="ListBullet"/>
+      </w:pPr>
+      <w:r>
         <w:t>Dopo un login utente riuscito, all'apertura della dashboard compare un popup di consenso download percorsi nel database della web app.</w:t>
       </w:r>
     </w:p>
     <w:p>
       <w:pPr>
-        <w:pStyle w:val="Heading2"/>
+        <w:pStyle w:val="ListBullet"/>
       </w:pPr>
       <w:r>
-        <w:t>2.2 Accesso Admin locale</w:t>
+        <w:t>Su desktop e tablet i pulsanti provider sono disposti lungo una fascia orizzontale senza didascalie interne; le informazioni di stato dei provider sono raccolte in un pannello dedicato sotto la fascia, sulla destra.</w:t>
       </w:r>
     </w:p>
     <w:p>
@@ -715,15 +779,95 @@
         <w:pStyle w:val="ListBullet"/>
       </w:pPr>
       <w:r>
-        <w:t>L'admin accede con username e password locali definiti nel file .env.</w:t>
+        <w:t>Su smartphone il layout resta verticale e proporzionato allo schermo, mantenendo la leggibilità dei pulsanti e dei blocchi informativi.</w:t>
       </w:r>
     </w:p>
     <w:p>
       <w:pPr>
+        <w:pStyle w:val="Heading2"/>
+      </w:pPr>
+      <w:r>
+        <w:t>2.2 Accesso locale admin e skater</w:t>
+      </w:r>
+    </w:p>
+    <w:p>
+      <w:pPr>
         <w:pStyle w:val="ListBullet"/>
       </w:pPr>
       <w:r>
-        <w:t>L'admin non usa provider esterni per autenticarsi.</w:t>
+        <w:t>L'accesso locale usa username e password applicative, senza passare da provider esterni.</w:t>
+      </w:r>
+    </w:p>
+    <w:p>
+      <w:pPr>
+        <w:pStyle w:val="ListBullet"/>
+      </w:pPr>
+      <w:r>
+        <w:t>L'admin bootstrap puo ancora essere definito nel file .env, ma dalla sezione admin e possibile creare ulteriori utenze locali di ruolo admin o skater.</w:t>
+      </w:r>
+    </w:p>
+    <w:p>
+      <w:pPr>
+        <w:pStyle w:val="ListBullet"/>
+      </w:pPr>
+      <w:r>
+        <w:t>Per ogni utenza locale creata vengono registrati anche email di riferimento e numero di cellulare, predisposti per futuri flussi OTP e 2FA.</w:t>
+      </w:r>
+    </w:p>
+    <w:p>
+      <w:pPr>
+        <w:pStyle w:val="ListBullet"/>
+      </w:pPr>
+      <w:r>
+        <w:t>Gli account locali di ruolo admin aprono la dashboard amministrativa completa.</w:t>
+      </w:r>
+    </w:p>
+    <w:p>
+      <w:pPr>
+        <w:pStyle w:val="ListBullet"/>
+      </w:pPr>
+      <w:r>
+        <w:t>Gli account locali di ruolo skater accedono all'archivio globale in sola lettura, come gli utenti provider.</w:t>
+      </w:r>
+    </w:p>
+    <w:p>
+      <w:pPr>
+        <w:pStyle w:val="ListBullet"/>
+      </w:pPr>
+      <w:r>
+        <w:t>Le richieste inviate dalla pagina Registrati non creano subito l'account: entrano prima nella coda admin di approvazione nuovi utenti.</w:t>
+      </w:r>
+    </w:p>
+    <w:p>
+      <w:pPr>
+        <w:pStyle w:val="ListBullet"/>
+      </w:pPr>
+      <w:r>
+        <w:t>Alla creazione dell'utenza il backend genera una password casuale di primo accesso e tenta di inviarla via email tramite Resend all'indirizzo associato all'utente.</w:t>
+      </w:r>
+    </w:p>
+    <w:p>
+      <w:pPr>
+        <w:pStyle w:val="ListBullet"/>
+      </w:pPr>
+      <w:r>
+        <w:t>Se l'invio mail non riesce, l'admin riceve comunque un messaggio di fallback con la password temporanea per poterla comunicare manualmente.</w:t>
+      </w:r>
+    </w:p>
+    <w:p>
+      <w:pPr>
+        <w:pStyle w:val="ListBullet"/>
+      </w:pPr>
+      <w:r>
+        <w:t>Quando una richiesta pubblica viene approvata, il sistema crea sempre un account di ruolo skater/user e imposta la richiesta su Eseguita: utenza creata. Solo dopo la conferma nel database tenta l'invio della mail di approvazione con password temporanea.</w:t>
+      </w:r>
+    </w:p>
+    <w:p>
+      <w:pPr>
+        <w:pStyle w:val="ListBullet"/>
+      </w:pPr>
+      <w:r>
+        <w:t>Quando una richiesta pubblica viene negata, il sistema può inviare una mail dedicata con esito negativo e note admin opzionali.</w:t>
       </w:r>
     </w:p>
     <w:p>
@@ -787,7 +931,15 @@
         <w:pStyle w:val="ListBullet"/>
       </w:pPr>
       <w:r>
-        <w:t>Le sessioni autenticate registrano timestamp di avvio e ultimo utilizzo; con la configurazione corrente, se l'utente resta inattivo per oltre 3 minuti la sessione viene invalidata e deve rifare login.</w:t>
+        <w:t>Le sessioni autenticate registrano timestamp di avvio e ultimo utilizzo; un timer lato browser e il controllo lato server invalidano la sessione dopo 3 minuti di inattività e richiedono un nuovo login. Il timeout resta sospeso mentre e attiva una richiesta applicativa interna, inclusi upload GPX/JSON, import provider e polling di avanzamento.</w:t>
+      </w:r>
+    </w:p>
+    <w:p>
+      <w:pPr>
+        <w:pStyle w:val="ListBullet"/>
+      </w:pPr>
+      <w:r>
+        <w:t>Alla chiusura della scheda il browser invia un segnale di logout al backend; il server cancella la sessione e registra session_tab_closed nell'audit log. Il segnale usa il ciclo di vita del browser e resta affiancato al timeout server come protezione di fallback.</w:t>
       </w:r>
     </w:p>
     <w:p>
@@ -843,6 +995,14 @@
         <w:pStyle w:val="ListBullet"/>
       </w:pPr>
       <w:r>
+        <w:t>Nel deploy VPS i secret sensibili non devono stare nel repository Git: il progetto supporta file sotto docker/secrets montati come /run/secrets, con priorita rispetto ai valori omonimi presenti nei file ambiente.</w:t>
+      </w:r>
+    </w:p>
+    <w:p>
+      <w:pPr>
+        <w:pStyle w:val="ListBullet"/>
+      </w:pPr>
+      <w:r>
         <w:t>I cookie di sessione sono configurabili via ambiente; in produzione il flag Secure deve restare attivo dietro HTTPS, mentre in sviluppo locale può restare disattivato per localhost.</w:t>
       </w:r>
     </w:p>
@@ -868,6 +1028,30 @@
       </w:pPr>
       <w:r>
         <w:t>Lo script della pagina dettaglio percorso è stato spostato in un file statico dedicato, così la CSP può evitare unsafe-inline per gli script applicativi.</w:t>
+      </w:r>
+    </w:p>
+    <w:p>
+      <w:pPr>
+        <w:pStyle w:val="ListBullet"/>
+      </w:pPr>
+      <w:r>
+        <w:t>Nel footer della login vengono mostrate le note operative già presenti e un timestamp corrente in basso a destra, utile per distinguere la build e il momento di caricamento della pagina.</w:t>
+      </w:r>
+    </w:p>
+    <w:p>
+      <w:pPr>
+        <w:pStyle w:val="ListBullet"/>
+      </w:pPr>
+      <w:r>
+        <w:t>Se un utente locale entra con password temporanea, viene reindirizzato obbligatoriamente a una pagina di cambio password prima di poter usare dashboard o sezione admin.</w:t>
+      </w:r>
+    </w:p>
+    <w:p>
+      <w:pPr>
+        <w:pStyle w:val="ListBullet"/>
+      </w:pPr>
+      <w:r>
+        <w:t>Gli utenti locali con password già definitiva possono aprire in qualsiasi momento la sezione Cambio password e, dopo autenticazione valida, tornano poi in dashboard.</w:t>
       </w:r>
     </w:p>
     <w:p>
@@ -939,66 +1123,7 @@
           <w:color w:val="475467"/>
           <w:sz w:val="19"/>
         </w:rPr>
-        <w:t>Schermata login con accesso provider e accesso Admin locale.</w:t>
-      </w:r>
-    </w:p>
-    <w:p>
-      <w:pPr>
-        <w:pStyle w:val="Heading2"/>
-      </w:pPr>
-      <w:r>
-        <w:t>3.2 Dashboard percorsi</w:t>
-      </w:r>
-    </w:p>
-    <w:p>
-      <w:r>
-        <w:drawing>
-          <wp:inline xmlns:a="http://schemas.openxmlformats.org/drawingml/2006/main" xmlns:pic="http://schemas.openxmlformats.org/drawingml/2006/picture">
-            <wp:extent cx="5669280" cy="2464239"/>
-            <wp:docPr id="2" name="Picture 2"/>
-            <wp:cNvGraphicFramePr>
-              <a:graphicFrameLocks noChangeAspect="1"/>
-            </wp:cNvGraphicFramePr>
-            <a:graphic>
-              <a:graphicData uri="http://schemas.openxmlformats.org/drawingml/2006/picture">
-                <pic:pic>
-                  <pic:nvPicPr>
-                    <pic:cNvPr id="0" name="Screenshot 2026-07-26 143332.png"/>
-                    <pic:cNvPicPr/>
-                  </pic:nvPicPr>
-                  <pic:blipFill>
-                    <a:blip r:embed="rId10"/>
-                    <a:stretch>
-                      <a:fillRect/>
-                    </a:stretch>
-                  </pic:blipFill>
-                  <pic:spPr>
-                    <a:xfrm>
-                      <a:off x="0" y="0"/>
-                      <a:ext cx="5669280" cy="2464239"/>
-                    </a:xfrm>
-                    <a:prstGeom prst="rect"/>
-                  </pic:spPr>
-                </pic:pic>
-              </a:graphicData>
-            </a:graphic>
-          </wp:inline>
-        </w:drawing>
-      </w:r>
-    </w:p>
-    <w:p>
-      <w:pPr>
-        <w:spacing w:after="200"/>
-        <w:jc w:val="center"/>
-      </w:pPr>
-      <w:r>
-        <w:rPr>
-          <w:rFonts w:ascii="Calibri" w:hAnsi="Calibri"/>
-          <w:i/>
-          <w:color w:val="475467"/>
-          <w:sz w:val="19"/>
-        </w:rPr>
-        <w:t>Dashboard percorsi con pulsanti import, riepiloghi e filtri laterali.</w:t>
+        <w:t>Schermata login con accesso provider e accesso locale admin/skater.</w:t>
       </w:r>
     </w:p>
     <w:p>
@@ -1038,7 +1163,23 @@
         <w:pStyle w:val="ListBullet"/>
       </w:pPr>
       <w:r>
-        <w:t>Il pulsante Importa risulta disabilitato per i login provider, perché il catalogo globale e in sola lettura.</w:t>
+        <w:t>Ogni utente autenticato consulta quindi lo stesso archivio globale dei percorsi gia presenti nel database.</w:t>
+      </w:r>
+    </w:p>
+    <w:p>
+      <w:pPr>
+        <w:pStyle w:val="ListBullet"/>
+      </w:pPr>
+      <w:r>
+        <w:t>Per Strava con scope activity:read_all, l'import parte automaticamente dopo il callback OAuth; senza tale scope il catalogo resta in sola lettura.</w:t>
+      </w:r>
+    </w:p>
+    <w:p>
+      <w:pPr>
+        <w:pStyle w:val="ListBullet"/>
+      </w:pPr>
+      <w:r>
+        <w:t>Pulsante Supporta: resta inattivo finché Stripe non è configurato con chiave segreta e Price ID; quando disponibile apre una pagina dedicata e avvia un pagamento volontario tramite Stripe Checkout.</w:t>
       </w:r>
     </w:p>
     <w:p>
@@ -1182,7 +1323,7 @@
         <w:pStyle w:val="ListBullet"/>
       </w:pPr>
       <w:r>
-        <w:t>Ogni card mostra score e livello di difficoltà.</w:t>
+        <w:t>Ogni card e un riepilogo compatto e cliccabile: mostra score, livello di difficoltà, nome, tipo, data, distanza, dislivello, pendenza massima, velocità media, autore, provider e stato sintetico dei controlli traccia.</w:t>
       </w:r>
     </w:p>
     <w:p>
@@ -1198,7 +1339,7 @@
         <w:pStyle w:val="ListBullet"/>
       </w:pPr>
       <w:r>
-        <w:t>Sono presenti nome percorso, tipo attività, data locale, distanza, dislivello, velocità media, pendenza massima assoluta, verso della pendenza massima, superficie, presenza sampietrini, pressione, temperatura e fonte dei dati.</w:t>
+        <w:t>Le metriche tecniche complete, il profilo pendenza, i controlli GPS/OSM estesi e la mappa sono disponibili nel dettaglio del singolo percorso.</w:t>
       </w:r>
     </w:p>
     <w:p>
@@ -1206,7 +1347,15 @@
         <w:pStyle w:val="ListBullet"/>
       </w:pPr>
       <w:r>
-        <w:t>Ogni card include il nome dell'utente importatore registrato sul record.</w:t>
+        <w:t>Ogni card include il nome dell'autore o utente importatore registrato sul record.</w:t>
+      </w:r>
+    </w:p>
+    <w:p>
+      <w:pPr>
+        <w:pStyle w:val="ListBullet"/>
+      </w:pPr>
+      <w:r>
+        <w:t>Ogni card mostra anche il provider di origine del percorso e la sorgente archivio usata dal record, distinguendo DB live e DB locale.</w:t>
       </w:r>
     </w:p>
     <w:p>
@@ -1222,7 +1371,7 @@
         <w:pStyle w:val="ListBullet"/>
       </w:pPr>
       <w:r>
-        <w:t>Il link sul nome apre il dettaglio del percorso.</w:t>
+        <w:t>Il click sulla card, oppure Invio o Spazio da tastiera, apre il dettaglio del percorso.</w:t>
       </w:r>
     </w:p>
     <w:p>
@@ -1801,7 +1950,7 @@
         <w:pStyle w:val="ListBullet"/>
       </w:pPr>
       <w:r>
-        <w:t>Dopo autenticazione utente riuscita, Street Skate mostra un popup/disclaimer in overlay sulla dashboard.</w:t>
+        <w:t>Il consenso per Strava viene raccolto esclusivamente nella pagina ufficiale OAuth del provider, non tramite checkbox interne a Street Skate.</w:t>
       </w:r>
     </w:p>
     <w:p>
@@ -1809,7 +1958,7 @@
         <w:pStyle w:val="ListBullet"/>
       </w:pPr>
       <w:r>
-        <w:t>Il disclaimer chiede l'autorizzazione a scaricare e salvare nel DB i percorsi dell'utente.</w:t>
+        <w:t>Per proseguire, nella pagina Strava deve essere concesso il permesso per tutte le attività private, corrispondente allo scope activity:read_all. Il profilo completo è facoltativo e non blocca l'import.</w:t>
       </w:r>
     </w:p>
     <w:p>
@@ -1817,7 +1966,7 @@
         <w:pStyle w:val="ListBullet"/>
       </w:pPr>
       <w:r>
-        <w:t>Se l'utente accetta, l'import provider parte automaticamente in background e il footer mostra un conteggio realtime nel formato [percorsi importati / percorsi totali]. A completamento import, il messaggio finale resta visibile per 8 secondi e poi il footer si nasconde.</w:t>
+        <w:t>Dopo il callback OAuth con lo scope activity:read_all, Street Skate salva il consenso nella sessione e avvia automaticamente l'import Strava in background al primo caricamento della dashboard.</w:t>
       </w:r>
     </w:p>
     <w:p>
@@ -1825,7 +1974,15 @@
         <w:pStyle w:val="ListBullet"/>
       </w:pPr>
       <w:r>
-        <w:t>Se l'utente rifiuta, l'accesso alla dashboard è consentito ma l'import viene bloccato lato interfaccia e lato API.</w:t>
+        <w:t>Il footer mostra il conteggio realtime [percorsi importati / percorsi totali]. A completamento import, il messaggio finale resta visibile per 8 secondi e poi il footer si nasconde.</w:t>
+      </w:r>
+    </w:p>
+    <w:p>
+      <w:pPr>
+        <w:pStyle w:val="ListBullet"/>
+      </w:pPr>
+      <w:r>
+        <w:t>Se Strava non concede activity:read_all, il login viene comunque completato: l'utente può consultare l'archivio globale Street Skate in sola lettura, ma l'import delle proprie attività non viene avviato.</w:t>
       </w:r>
     </w:p>
     <w:p>
@@ -1934,6 +2091,70 @@
     </w:p>
     <w:p>
       <w:pPr>
+        <w:pStyle w:val="Heading3"/>
+      </w:pPr>
+      <w:r>
+        <w:t>5.3.1 Controllo integrità GPS e rete percorribile</w:t>
+      </w:r>
+    </w:p>
+    <w:p>
+      <w:pPr>
+        <w:pStyle w:val="ListBullet"/>
+      </w:pPr>
+      <w:r>
+        <w:t>Per ogni nuovo percorso con punti GPS, Street Skate analizza le coppie di punti contigui e salva l'esito nel campo Integrità GPS.</w:t>
+      </w:r>
+    </w:p>
+    <w:p>
+      <w:pPr>
+        <w:pStyle w:val="ListBullet"/>
+      </w:pPr>
+      <w:r>
+        <w:t>Vengono segnalati segmenti consecutivi oltre 250 m, punti temporalmente coincidenti o invertiti distanti almeno 50 m, velocità calcolate oltre 65 km/h e lunghi salti con intervallo temporale di almeno 120 secondi.</w:t>
+      </w:r>
+    </w:p>
+    <w:p>
+      <w:pPr>
+        <w:pStyle w:val="ListBullet"/>
+      </w:pPr>
+      <w:r>
+        <w:t>Il controllo evidenzia possibili ricostruzioni rettilinee del provider dopo perdita GPS, come il collegamento tra ultimo punto valido e punto di riaggancio; non elimina automaticamente il percorso.</w:t>
+      </w:r>
+    </w:p>
+    <w:p>
+      <w:pPr>
+        <w:pStyle w:val="ListBullet"/>
+      </w:pPr>
+      <w:r>
+        <w:t>La traccia viene inoltre campionata e confrontata con OpenStreetMap: strade, piste ciclabili, sentieri, strade bianche e aree parco disponibili nella mappa OSM.</w:t>
+      </w:r>
+    </w:p>
+    <w:p>
+      <w:pPr>
+        <w:pStyle w:val="ListBullet"/>
+      </w:pPr>
+      <w:r>
+        <w:t>Il campo Coerenza rete OSM segnala un avviso quando oltre il 20% dei campioni risulta oltre 35 m dalla rete percorribile OSM. I campioni intermedi dei segmenti lunghi aiutano a rilevare possibili tagli di vie.</w:t>
+      </w:r>
+    </w:p>
+    <w:p>
+      <w:pPr>
+        <w:pStyle w:val="ListBullet"/>
+      </w:pPr>
+      <w:r>
+        <w:t>Un avviso OSM non prova da solo un errore: la mappa può essere incompleta o non aggiornata. L'esito serve a richiedere una verifica visiva del tracciato nella pagina dettaglio.</w:t>
+      </w:r>
+    </w:p>
+    <w:p>
+      <w:pPr>
+        <w:pStyle w:val="ListBullet"/>
+      </w:pPr>
+      <w:r>
+        <w:t>Le soglie sono configurabili con GPS_QUALITY_LONG_SEGMENT_M, GPS_QUALITY_TIME_COLLISION_DISTANCE_M, GPS_QUALITY_IMPLAUSIBLE_SPEED_KMH, GPS_QUALITY_ELAPSED_GAP_SEC, OSM_ROUTE_MATCH_RADIUS_M e OSM_ROUTE_MATCH_SAMPLE_LIMIT.</w:t>
+      </w:r>
+    </w:p>
+    <w:p>
+      <w:pPr>
         <w:pStyle w:val="Heading2"/>
       </w:pPr>
       <w:r>
@@ -2081,7 +2302,7 @@
         <w:pStyle w:val="ListBullet"/>
       </w:pPr>
       <w:r>
-        <w:t>Barra di avanzamento dedicata per il batch manuale.</w:t>
+        <w:t>Barra di avanzamento dedicata per il batch manuale. I file selezionati vengono raggruppati in coppie GPX/JSON omonime e inviati in piccoli batch di cinque percorsi, per evitare saturazione della memoria del browser o del container web.</w:t>
       </w:r>
     </w:p>
     <w:p>
@@ -2089,7 +2310,7 @@
         <w:pStyle w:val="ListBullet"/>
       </w:pPr>
       <w:r>
-        <w:t>Scarto per file troppo corti, tipo attività non ammesso, nome file già presente o contenuto ritenuto duplicato.</w:t>
+        <w:t>Prima del parsing, il nome del file GPX viene confrontato senza distinzione maiuscole/minuscole con i filename già salvati nel database: un nome uguale viene scartato immediatamente. File con nomi diversi vengono importati anche se la traccia presenta contenuto o estremi simili.</w:t>
       </w:r>
     </w:p>
     <w:p>
@@ -2097,7 +2318,15 @@
         <w:pStyle w:val="ListBullet"/>
       </w:pPr>
       <w:r>
-        <w:t>La deduplica dell'import manuale confronta il nuovo percorso contro tutta la cache già presente, non solo contro i percorsi manuali.</w:t>
+        <w:t>L'esito dell'import mostra quanti percorsi sono stati scartati per nome file, oltre agli scarti per file troppo corti o tipo attività non ammesso.</w:t>
+      </w:r>
+    </w:p>
+    <w:p>
+      <w:pPr>
+        <w:pStyle w:val="ListBullet"/>
+      </w:pPr>
+      <w:r>
+        <w:t>La deduplica dell'import manuale usa il filename GPX registrato nel database, indipendentemente dall'utente che aveva eseguito un caricamento precedente.</w:t>
       </w:r>
     </w:p>
     <w:p>
@@ -2129,7 +2358,23 @@
         <w:pStyle w:val="ListBullet"/>
       </w:pPr>
       <w:r>
-        <w:t>Pulsanti autenticazione provider: pannello admin con checkbox per decidere se ciascun provider OAuth deve essere visibile nella home e se il relativo pulsante deve risultare cliccabile.</w:t>
+        <w:t>Utenze locali: form admin per creare account applicativi di ruolo admin o skater con username, nome, email e cellulare; il sistema genera una password temporanea di primo accesso, prova a inviarla via Resend e mantiene l'elenco utenti locali gia registrati.</w:t>
+      </w:r>
+    </w:p>
+    <w:p>
+      <w:pPr>
+        <w:pStyle w:val="ListBullet"/>
+      </w:pPr>
+      <w:r>
+        <w:t>Accettazione nuovi utenti: pannello admin con badge richieste In attesa di revisione, elenco richieste e link al dettaglio di ogni notifica di tipo Nuovo utente. Gli esiti sono In attesa di revisione, Eseguita: utenza creata o Rifiutata.</w:t>
+      </w:r>
+    </w:p>
+    <w:p>
+      <w:pPr>
+        <w:pStyle w:val="ListBullet"/>
+      </w:pPr>
+      <w:r>
+        <w:t>Pulsanti autenticazione provider: pannello admin con checkbox per decidere se ciascun provider OAuth deve essere visibile nella home e se il relativo pulsante deve risultare cliccabile. Il predefinito corrente mostra Strava abilitato e Suunto non cliccabile; gli altri provider sono nascosti e disabilitati.</w:t>
       </w:r>
     </w:p>
     <w:p>
@@ -2336,6 +2581,130 @@
                 <w:b w:val="0"/>
                 <w:sz w:val="21"/>
               </w:rPr>
+              <w:t>Utenze locali</w:t>
+            </w:r>
+          </w:p>
+        </w:tc>
+        <w:tc>
+          <w:tcPr>
+            <w:tcW w:type="dxa" w:w="3120"/>
+            <w:vAlign w:val="center"/>
+          </w:tcPr>
+          <w:p>
+            <w:pPr>
+              <w:jc w:val="left"/>
+            </w:pPr>
+            <w:r/>
+            <w:r>
+              <w:rPr>
+                <w:rFonts w:ascii="Calibri" w:hAnsi="Calibri"/>
+                <w:b w:val="0"/>
+                <w:sz w:val="21"/>
+              </w:rPr>
+              <w:t>username, display_name, email, phone, role</w:t>
+            </w:r>
+          </w:p>
+        </w:tc>
+        <w:tc>
+          <w:tcPr>
+            <w:tcW w:type="dxa" w:w="3120"/>
+            <w:vAlign w:val="center"/>
+          </w:tcPr>
+          <w:p>
+            <w:pPr>
+              <w:jc w:val="left"/>
+            </w:pPr>
+            <w:r/>
+            <w:r>
+              <w:rPr>
+                <w:rFonts w:ascii="Calibri" w:hAnsi="Calibri"/>
+                <w:b w:val="0"/>
+                <w:sz w:val="21"/>
+              </w:rPr>
+              <w:t>Permette di creare accessi locali admin o skater, inviare credenziali iniziali via Resend e imporre cambio password al primo accesso</w:t>
+            </w:r>
+          </w:p>
+        </w:tc>
+      </w:tr>
+      <w:tr>
+        <w:tc>
+          <w:tcPr>
+            <w:tcW w:type="dxa" w:w="3120"/>
+            <w:vAlign w:val="center"/>
+          </w:tcPr>
+          <w:p>
+            <w:pPr>
+              <w:jc w:val="left"/>
+            </w:pPr>
+            <w:r/>
+            <w:r>
+              <w:rPr>
+                <w:rFonts w:ascii="Calibri" w:hAnsi="Calibri"/>
+                <w:b w:val="0"/>
+                <w:sz w:val="21"/>
+              </w:rPr>
+              <w:t>Richieste utenti</w:t>
+            </w:r>
+          </w:p>
+        </w:tc>
+        <w:tc>
+          <w:tcPr>
+            <w:tcW w:type="dxa" w:w="3120"/>
+            <w:vAlign w:val="center"/>
+          </w:tcPr>
+          <w:p>
+            <w:pPr>
+              <w:jc w:val="left"/>
+            </w:pPr>
+            <w:r/>
+            <w:r>
+              <w:rPr>
+                <w:rFonts w:ascii="Calibri" w:hAnsi="Calibri"/>
+                <w:b w:val="0"/>
+                <w:sz w:val="21"/>
+              </w:rPr>
+              <w:t>first_name, last_name, username, birth_date, email, phone, status</w:t>
+            </w:r>
+          </w:p>
+        </w:tc>
+        <w:tc>
+          <w:tcPr>
+            <w:tcW w:type="dxa" w:w="3120"/>
+            <w:vAlign w:val="center"/>
+          </w:tcPr>
+          <w:p>
+            <w:pPr>
+              <w:jc w:val="left"/>
+            </w:pPr>
+            <w:r/>
+            <w:r>
+              <w:rPr>
+                <w:rFonts w:ascii="Calibri" w:hAnsi="Calibri"/>
+                <w:b w:val="0"/>
+                <w:sz w:val="21"/>
+              </w:rPr>
+              <w:t>Registra le richieste pubbliche, mostra il badge In attesa di revisione e permette approvazione o rifiuto. L'approvazione registra Eseguita: utenza creata</w:t>
+            </w:r>
+          </w:p>
+        </w:tc>
+      </w:tr>
+      <w:tr>
+        <w:tc>
+          <w:tcPr>
+            <w:tcW w:type="dxa" w:w="3120"/>
+            <w:vAlign w:val="center"/>
+          </w:tcPr>
+          <w:p>
+            <w:pPr>
+              <w:jc w:val="left"/>
+            </w:pPr>
+            <w:r/>
+            <w:r>
+              <w:rPr>
+                <w:rFonts w:ascii="Calibri" w:hAnsi="Calibri"/>
+                <w:b w:val="0"/>
+                <w:sz w:val="21"/>
+              </w:rPr>
               <w:t>Pulsanti provider</w:t>
             </w:r>
           </w:p>
@@ -2376,7 +2745,7 @@
                 <w:b w:val="0"/>
                 <w:sz w:val="21"/>
               </w:rPr>
-              <w:t>Controlla visibilità e click dei pulsanti OAuth nella pagina login</w:t>
+              <w:t>Controlla visibilità e click dei pulsanti OAuth nella pagina login; il predefinito iniziale replica la configurazione corrente</w:t>
             </w:r>
           </w:p>
         </w:tc>
@@ -2742,7 +3111,7 @@
         <w:pStyle w:val="ListBullet"/>
       </w:pPr>
       <w:r>
-        <w:t>Le principali variabili sessione sono SESSION_COOKIE_BROWSER_CLOSE, SESSION_COOKIE_MAX_AGE_SEC e SESSION_INACTIVITY_TIMEOUT_SEC.</w:t>
+        <w:t>Le principali variabili sessione sono SESSION_COOKIE_BROWSER_CLOSE, SESSION_COOKIE_MAX_AGE_SEC e SESSION_INACTIVITY_TIMEOUT_SEC. Il timer lato browser usa SESSION_INACTIVITY_TIMEOUT_SEC.</w:t>
       </w:r>
     </w:p>
     <w:p>
@@ -2766,6 +3135,38 @@
         <w:pStyle w:val="ListBullet"/>
       </w:pPr>
       <w:r>
+        <w:t>Resend è operativo per l'invio di conferme registrazione, esiti di approvazione o negazione e credenziali temporanee. La configurazione usa RESEND_API_KEY o RESEND_API_KEY_FILE, RESEND_FROM_EMAIL e opzionalmente RESEND_REPLY_TO.</w:t>
+      </w:r>
+    </w:p>
+    <w:p>
+      <w:pPr>
+        <w:pStyle w:val="ListBullet"/>
+      </w:pPr>
+      <w:r>
+        <w:t>Le richieste pubbliche registrate nella tabella dedicata user_registration_requests vengono approvate o negate da admin. L'approvazione crea l'account nella tabella users e aggiorna nella stessa transazione lo stato richiesta a Eseguita: utenza creata. Anche l'admin bootstrap definito tramite file ambiente puo approvare le richieste, pur non avendo un record locale nella tabella users.</w:t>
+      </w:r>
+    </w:p>
+    <w:p>
+      <w:pPr>
+        <w:pStyle w:val="ListBullet"/>
+      </w:pPr>
+      <w:r>
+        <w:t>Nel deploy corrente il codice applicativo viene mantenuto in GitHub come sorgente del progetto, mentre il VPS conserva separatamente .env.production e i file in docker/secrets, esclusi dal versionamento.</w:t>
+      </w:r>
+    </w:p>
+    <w:p>
+      <w:pPr>
+        <w:pStyle w:val="ListBullet"/>
+      </w:pPr>
+      <w:r>
+        <w:t>Quando si aggiorna la produzione dopo modifiche locali, il flusso corretto e: sincronizzare il codice sul server, verificare che .env.production e docker/secrets contengano ancora client_id, client_secret e password necessari, quindi ricostruire i container.</w:t>
+      </w:r>
+    </w:p>
+    <w:p>
+      <w:pPr>
+        <w:pStyle w:val="ListBullet"/>
+      </w:pPr>
+      <w:r>
         <w:t>Per un deploy pubblico HTTPS, impostare anche SECURITY_ENABLE_HSTS=true dietro reverse proxy TLS stabile.</w:t>
       </w:r>
     </w:p>
@@ -2782,6 +3183,14 @@
         <w:pStyle w:val="ListBullet"/>
       </w:pPr>
       <w:r>
+        <w:t>Per evitare carichi eccessivi nel browser, dashboard e API elenco inviano solo un riepilogo del percorso e un campione del profilo pendenza; tutti i punti GPS completi restano disponibili soltanto nella pagina di dettaglio del singolo percorso.</w:t>
+      </w:r>
+    </w:p>
+    <w:p>
+      <w:pPr>
+        <w:pStyle w:val="ListBullet"/>
+      </w:pPr>
+      <w:r>
         <w:t>La barra di import può essere numerica o animata, a seconda del tipo di import disponibile.</w:t>
       </w:r>
     </w:p>
@@ -2798,7 +3207,7 @@
         <w:pStyle w:val="ListBullet"/>
       </w:pPr>
       <w:r>
-        <w:t>L'utente standard vede solo i propri percorsi; l'admin vede tutto l'archivio.</w:t>
+        <w:t>Con la configurazione attuale i login provider vedono l'archivio globale in sola lettura; l'admin vede tutto l'archivio con pieni permessi di gestione.</w:t>
       </w:r>
     </w:p>
     <w:p>
@@ -2830,7 +3239,39 @@
         <w:pStyle w:val="Heading2"/>
       </w:pPr>
       <w:r>
-        <w:t>8.1 Condivisione temporanea della web app da PC locale</w:t>
+        <w:t>8.1 Avvio locale con Docker Desktop</w:t>
+      </w:r>
+    </w:p>
+    <w:p>
+      <w:pPr>
+        <w:pStyle w:val="ListBullet"/>
+      </w:pPr>
+      <w:r>
+        <w:t>Il file start-local.ps1, nella cartella principale del progetto, avvia Docker Desktop se non e gia disponibile, attende il daemon Docker e avvia docker compose up --build.</w:t>
+      </w:r>
+    </w:p>
+    <w:p>
+      <w:pPr>
+        <w:pStyle w:val="ListBullet"/>
+      </w:pPr>
+      <w:r>
+        <w:t>Da PowerShell eseguire: powershell -ExecutionPolicy Bypass -File .\start-local.ps1.</w:t>
+      </w:r>
+    </w:p>
+    <w:p>
+      <w:pPr>
+        <w:pStyle w:val="ListBullet"/>
+      </w:pPr>
+      <w:r>
+        <w:t>Al termine dell'avvio, l'app e disponibile su http://localhost:5000. Per fermarla usare Ctrl+C nella finestra dello script.</w:t>
+      </w:r>
+    </w:p>
+    <w:p>
+      <w:pPr>
+        <w:pStyle w:val="Heading2"/>
+      </w:pPr>
+      <w:r>
+        <w:t>8.2 Condivisione temporanea della web app da PC locale</w:t>
       </w:r>
     </w:p>
     <w:p>
@@ -2902,7 +3343,7 @@
         <w:pStyle w:val="Heading2"/>
       </w:pPr>
       <w:r>
-        <w:t>8.2 Possibili implementazioni future</w:t>
+        <w:t>8.3 Possibili implementazioni future</w:t>
       </w:r>
     </w:p>
     <w:p>
@@ -3089,7 +3530,7 @@
                 <w:b w:val="0"/>
                 <w:sz w:val="21"/>
               </w:rPr>
-              <w:t>Login provider, import provider, filtrare, vedere dettagli, cancellare i propri percorsi</w:t>
+              <w:t>Login provider o account locale skater, vedere l'archivio globale, filtrare, vedere dettagli, punteggi fissi e cambiare password locale</w:t>
             </w:r>
           </w:p>
         </w:tc>
@@ -3109,7 +3550,7 @@
                 <w:b w:val="0"/>
                 <w:sz w:val="21"/>
               </w:rPr>
-              <w:t>Non accede alle impostazioni admin e non vede l'archivio completo</w:t>
+              <w:t>Archivio in sola lettura: non accede alle impostazioni admin e non puo importare o cancellare percorsi</w:t>
             </w:r>
           </w:p>
         </w:tc>
@@ -3151,7 +3592,7 @@
                 <w:b w:val="0"/>
                 <w:sz w:val="21"/>
               </w:rPr>
-              <w:t>Login locale, vedere tutti i percorsi, import manuale GPX/JSON, filtrare per utente, modificare parametri applicativi, leggere audit log, cancellare qualsiasi percorso</w:t>
+              <w:t>Login locale, vedere tutti i percorsi, import manuale GPX/JSON, filtrare per utente, modificare parametri applicativi, approvare richieste utenti, leggere audit log, cancellare qualsiasi percorso</w:t>
             </w:r>
           </w:p>
         </w:tc>
@@ -3334,8 +3775,709 @@
         <w:t>Per i percorsi importati da file, l'app può salvare anche una difficoltà dichiarata derivata dal calendario in base alla data nel nome del file, mantenendola separata dal punteggio calcolato.</w:t>
       </w:r>
     </w:p>
+    <w:p>
+      <w:pPr>
+        <w:pStyle w:val="Heading1"/>
+      </w:pPr>
+      <w:r>
+        <w:t>11. Punti aperti per la prossima sessione</w:t>
+      </w:r>
+    </w:p>
+    <w:p>
+      <w:r>
+        <w:t>Elenco operativo dei temi ancora aperti per la successiva sessione di progettazione e sviluppo.</w:t>
+      </w:r>
+    </w:p>
+    <w:p>
+      <w:pPr>
+        <w:pStyle w:val="ListNumber"/>
+      </w:pPr>
+      <w:r>
+        <w:t>Definire il testo definitivo delle email automatiche per conferma richiesta, approvazione e negazione utenza, inclusi mittente, oggetto e tono del messaggio.</w:t>
+      </w:r>
+    </w:p>
+    <w:p>
+      <w:pPr>
+        <w:pStyle w:val="ListNumber"/>
+      </w:pPr>
+      <w:r>
+        <w:t>Completare e testare end-to-end il flusso di registrazione pubblica, approvazione admin, invio credenziali, primo login e cambio password obbligatorio.</w:t>
+      </w:r>
+    </w:p>
+    <w:p>
+      <w:pPr>
+        <w:pStyle w:val="ListNumber"/>
+      </w:pPr>
+      <w:r>
+        <w:t>Adattare ulteriormente la UI in base al device corrente, con rifiniture dedicate a PC, smartphone e tablet.</w:t>
+      </w:r>
+    </w:p>
+    <w:p>
+      <w:pPr>
+        <w:pStyle w:val="ListNumber"/>
+      </w:pPr>
+      <w:r>
+        <w:t>Eseguire un caricamento locale completo dei percorsi adidas Running e verificare sistematicamente eventuali duplicati residui prima di nuovi import.</w:t>
+      </w:r>
+    </w:p>
+    <w:p>
+      <w:pPr>
+        <w:pStyle w:val="ListNumber"/>
+      </w:pPr>
+      <w:r>
+        <w:t>Importare il GPX del giro di ieri e validare gli avvisi di perdita segnale GPS e coerenza OSM, verificando in particolare eventuali segmenti rettilinei tra ultimo punto GPS e riaggancio. Regolare le soglie per evitare falsi positivi dovuti a pause automatiche, viabilità non mappata o export con punti radi.</w:t>
+      </w:r>
+    </w:p>
+    <w:p>
+      <w:pPr>
+        <w:pStyle w:val="ListNumber"/>
+      </w:pPr>
+      <w:r>
+        <w:t>Verificare se i percorsi storici già presenti nel profilo admin risultano coerenti e pienamente fruibili per tutte le utenze globali.</w:t>
+      </w:r>
+    </w:p>
+    <w:p>
+      <w:pPr>
+        <w:pStyle w:val="ListNumber"/>
+      </w:pPr>
+      <w:r>
+        <w:t>Implementare una rotta admin dedicata alla visualizzazione globale dei percorsi GPX presenti nel database, con mappa unica, caricamento di tutti i tracciati e possibilità di zoom in e zoom out.</w:t>
+      </w:r>
+    </w:p>
+    <w:p>
+      <w:pPr>
+        <w:pStyle w:val="ListNumber"/>
+      </w:pPr>
+      <w:r>
+        <w:t>Mantenere in sospeso le integrazioni provider non ancora operative o in review, in particolare adidas Running, Garmin, Suunto e Inline Route Tracking, fino alla disponibilità di API o credenziali definitive. La richiesta credenziali MapMyRun e stata inviata: alla ricezione configurare client ID e secret, callback pubblico e test OAuth/workout.</w:t>
+      </w:r>
+    </w:p>
+    <w:p>
+      <w:r>
+        <w:br w:type="page"/>
+      </w:r>
+    </w:p>
+    <w:p>
+      <w:pPr>
+        <w:pStyle w:val="Heading1"/>
+      </w:pPr>
+      <w:r>
+        <w:t>12. Prospetto sostenibilità provider</w:t>
+      </w:r>
+    </w:p>
+    <w:p>
+      <w:r>
+        <w:t>Il prospetto distingue la disponibilità tecnica dall'eventuale costo ricorrente. Nessun provider a pagamento deve essere attivato per utenti terzi senza conferma scritta della licenza multiutente e senza una copertura economica dedicata.</w:t>
+      </w:r>
+    </w:p>
+    <w:tbl>
+      <w:tblPr>
+        <w:tblW w:type="auto" w:w="0"/>
+        <w:jc w:val="left"/>
+        <w:tblLayout w:type="fixed"/>
+        <w:tblLook w:firstColumn="1" w:firstRow="1" w:lastColumn="0" w:lastRow="0" w:noHBand="0" w:noVBand="1" w:val="04A0"/>
+      </w:tblPr>
+      <w:tblGrid>
+        <w:gridCol w:w="2340"/>
+        <w:gridCol w:w="2340"/>
+        <w:gridCol w:w="2340"/>
+        <w:gridCol w:w="2340"/>
+      </w:tblGrid>
+      <w:tr>
+        <w:tc>
+          <w:tcPr>
+            <w:tcW w:type="dxa" w:w="1728"/>
+            <w:vAlign w:val="center"/>
+            <w:shd w:fill="DCE6F2"/>
+          </w:tcPr>
+          <w:p>
+            <w:pPr>
+              <w:jc w:val="left"/>
+            </w:pPr>
+            <w:r/>
+            <w:r>
+              <w:rPr>
+                <w:rFonts w:ascii="Calibri" w:hAnsi="Calibri"/>
+                <w:b/>
+                <w:sz w:val="21"/>
+              </w:rPr>
+              <w:t>Provider</w:t>
+            </w:r>
+          </w:p>
+        </w:tc>
+        <w:tc>
+          <w:tcPr>
+            <w:tcW w:type="dxa" w:w="2232"/>
+            <w:vAlign w:val="center"/>
+            <w:shd w:fill="DCE6F2"/>
+          </w:tcPr>
+          <w:p>
+            <w:pPr>
+              <w:jc w:val="left"/>
+            </w:pPr>
+            <w:r/>
+            <w:r>
+              <w:rPr>
+                <w:rFonts w:ascii="Calibri" w:hAnsi="Calibri"/>
+                <w:b/>
+                <w:sz w:val="21"/>
+              </w:rPr>
+              <w:t>Stato API/licenza</w:t>
+            </w:r>
+          </w:p>
+        </w:tc>
+        <w:tc>
+          <w:tcPr>
+            <w:tcW w:type="dxa" w:w="1656"/>
+            <w:vAlign w:val="center"/>
+            <w:shd w:fill="DCE6F2"/>
+          </w:tcPr>
+          <w:p>
+            <w:pPr>
+              <w:jc w:val="left"/>
+            </w:pPr>
+            <w:r/>
+            <w:r>
+              <w:rPr>
+                <w:rFonts w:ascii="Calibri" w:hAnsi="Calibri"/>
+                <w:b/>
+                <w:sz w:val="21"/>
+              </w:rPr>
+              <w:t>Costo noto</w:t>
+            </w:r>
+          </w:p>
+        </w:tc>
+        <w:tc>
+          <w:tcPr>
+            <w:tcW w:type="dxa" w:w="3888"/>
+            <w:vAlign w:val="center"/>
+            <w:shd w:fill="DCE6F2"/>
+          </w:tcPr>
+          <w:p>
+            <w:pPr>
+              <w:jc w:val="left"/>
+            </w:pPr>
+            <w:r/>
+            <w:r>
+              <w:rPr>
+                <w:rFonts w:ascii="Calibri" w:hAnsi="Calibri"/>
+                <w:b/>
+                <w:sz w:val="21"/>
+              </w:rPr>
+              <w:t>Decisione o prossimo passo</w:t>
+            </w:r>
+          </w:p>
+        </w:tc>
+      </w:tr>
+      <w:tr>
+        <w:tc>
+          <w:tcPr>
+            <w:tcW w:type="dxa" w:w="2340"/>
+            <w:vAlign w:val="center"/>
+          </w:tcPr>
+          <w:p>
+            <w:pPr>
+              <w:jc w:val="left"/>
+            </w:pPr>
+            <w:r/>
+            <w:r>
+              <w:rPr>
+                <w:rFonts w:ascii="Calibri" w:hAnsi="Calibri"/>
+                <w:b w:val="0"/>
+                <w:sz w:val="21"/>
+              </w:rPr>
+              <w:t>Strava</w:t>
+            </w:r>
+          </w:p>
+        </w:tc>
+        <w:tc>
+          <w:tcPr>
+            <w:tcW w:type="dxa" w:w="2340"/>
+            <w:vAlign w:val="center"/>
+          </w:tcPr>
+          <w:p>
+            <w:pPr>
+              <w:jc w:val="left"/>
+            </w:pPr>
+            <w:r/>
+            <w:r>
+              <w:rPr>
+                <w:rFonts w:ascii="Calibri" w:hAnsi="Calibri"/>
+                <w:b w:val="0"/>
+                <w:sz w:val="21"/>
+              </w:rPr>
+              <w:t>OAuth attivo; limiti atleti da verificare</w:t>
+            </w:r>
+          </w:p>
+        </w:tc>
+        <w:tc>
+          <w:tcPr>
+            <w:tcW w:type="dxa" w:w="2340"/>
+            <w:vAlign w:val="center"/>
+          </w:tcPr>
+          <w:p>
+            <w:pPr>
+              <w:jc w:val="left"/>
+            </w:pPr>
+            <w:r/>
+            <w:r>
+              <w:rPr>
+                <w:rFonts w:ascii="Calibri" w:hAnsi="Calibri"/>
+                <w:b w:val="0"/>
+                <w:sz w:val="21"/>
+              </w:rPr>
+              <w:t>n.d.</w:t>
+            </w:r>
+          </w:p>
+        </w:tc>
+        <w:tc>
+          <w:tcPr>
+            <w:tcW w:type="dxa" w:w="2340"/>
+            <w:vAlign w:val="center"/>
+          </w:tcPr>
+          <w:p>
+            <w:pPr>
+              <w:jc w:val="left"/>
+            </w:pPr>
+            <w:r/>
+            <w:r>
+              <w:rPr>
+                <w:rFonts w:ascii="Calibri" w:hAnsi="Calibri"/>
+                <w:b w:val="0"/>
+                <w:sz w:val="21"/>
+              </w:rPr>
+              <w:t>Mantenere attivo solo entro i limiti concessi dall'app Strava.</w:t>
+            </w:r>
+          </w:p>
+        </w:tc>
+      </w:tr>
+      <w:tr>
+        <w:tc>
+          <w:tcPr>
+            <w:tcW w:type="dxa" w:w="2340"/>
+            <w:vAlign w:val="center"/>
+          </w:tcPr>
+          <w:p>
+            <w:pPr>
+              <w:jc w:val="left"/>
+            </w:pPr>
+            <w:r/>
+            <w:r>
+              <w:rPr>
+                <w:rFonts w:ascii="Calibri" w:hAnsi="Calibri"/>
+                <w:b w:val="0"/>
+                <w:sz w:val="21"/>
+              </w:rPr>
+              <w:t>MapMyRun</w:t>
+            </w:r>
+          </w:p>
+        </w:tc>
+        <w:tc>
+          <w:tcPr>
+            <w:tcW w:type="dxa" w:w="2340"/>
+            <w:vAlign w:val="center"/>
+          </w:tcPr>
+          <w:p>
+            <w:pPr>
+              <w:jc w:val="left"/>
+            </w:pPr>
+            <w:r/>
+            <w:r>
+              <w:rPr>
+                <w:rFonts w:ascii="Calibri" w:hAnsi="Calibri"/>
+                <w:b w:val="0"/>
+                <w:sz w:val="21"/>
+              </w:rPr>
+              <w:t>API promessa con MVP personale; uso multiutente e GPS da confermare</w:t>
+            </w:r>
+          </w:p>
+        </w:tc>
+        <w:tc>
+          <w:tcPr>
+            <w:tcW w:type="dxa" w:w="2340"/>
+            <w:vAlign w:val="center"/>
+          </w:tcPr>
+          <w:p>
+            <w:pPr>
+              <w:jc w:val="left"/>
+            </w:pPr>
+            <w:r/>
+            <w:r>
+              <w:rPr>
+                <w:rFonts w:ascii="Calibri" w:hAnsi="Calibri"/>
+                <w:b w:val="0"/>
+                <w:sz w:val="21"/>
+              </w:rPr>
+              <w:t>USD 29,99/anno</w:t>
+            </w:r>
+          </w:p>
+        </w:tc>
+        <w:tc>
+          <w:tcPr>
+            <w:tcW w:type="dxa" w:w="2340"/>
+            <w:vAlign w:val="center"/>
+          </w:tcPr>
+          <w:p>
+            <w:pPr>
+              <w:jc w:val="left"/>
+            </w:pPr>
+            <w:r/>
+            <w:r>
+              <w:rPr>
+                <w:rFonts w:ascii="Calibri" w:hAnsi="Calibri"/>
+                <w:b w:val="0"/>
+                <w:sz w:val="21"/>
+              </w:rPr>
+              <w:t>Sconto Ryan 25% già applicato nel link. Attendere conferma scritta prima dell'acquisto.</w:t>
+            </w:r>
+          </w:p>
+        </w:tc>
+      </w:tr>
+      <w:tr>
+        <w:tc>
+          <w:tcPr>
+            <w:tcW w:type="dxa" w:w="2340"/>
+            <w:vAlign w:val="center"/>
+          </w:tcPr>
+          <w:p>
+            <w:pPr>
+              <w:jc w:val="left"/>
+            </w:pPr>
+            <w:r/>
+            <w:r>
+              <w:rPr>
+                <w:rFonts w:ascii="Calibri" w:hAnsi="Calibri"/>
+                <w:b w:val="0"/>
+                <w:sz w:val="21"/>
+              </w:rPr>
+              <w:t>Suunto</w:t>
+            </w:r>
+          </w:p>
+        </w:tc>
+        <w:tc>
+          <w:tcPr>
+            <w:tcW w:type="dxa" w:w="2340"/>
+            <w:vAlign w:val="center"/>
+          </w:tcPr>
+          <w:p>
+            <w:pPr>
+              <w:jc w:val="left"/>
+            </w:pPr>
+            <w:r/>
+            <w:r>
+              <w:rPr>
+                <w:rFonts w:ascii="Calibri" w:hAnsi="Calibri"/>
+                <w:b w:val="0"/>
+                <w:sz w:val="21"/>
+              </w:rPr>
+              <w:t>Partner Program in review</w:t>
+            </w:r>
+          </w:p>
+        </w:tc>
+        <w:tc>
+          <w:tcPr>
+            <w:tcW w:type="dxa" w:w="2340"/>
+            <w:vAlign w:val="center"/>
+          </w:tcPr>
+          <w:p>
+            <w:pPr>
+              <w:jc w:val="left"/>
+            </w:pPr>
+            <w:r/>
+            <w:r>
+              <w:rPr>
+                <w:rFonts w:ascii="Calibri" w:hAnsi="Calibri"/>
+                <w:b w:val="0"/>
+                <w:sz w:val="21"/>
+              </w:rPr>
+              <w:t>n.d.</w:t>
+            </w:r>
+          </w:p>
+        </w:tc>
+        <w:tc>
+          <w:tcPr>
+            <w:tcW w:type="dxa" w:w="2340"/>
+            <w:vAlign w:val="center"/>
+          </w:tcPr>
+          <w:p>
+            <w:pPr>
+              <w:jc w:val="left"/>
+            </w:pPr>
+            <w:r/>
+            <w:r>
+              <w:rPr>
+                <w:rFonts w:ascii="Calibri" w:hAnsi="Calibri"/>
+                <w:b w:val="0"/>
+                <w:sz w:val="21"/>
+              </w:rPr>
+              <w:t>Attendere esito partnership, condizioni API e costi.</w:t>
+            </w:r>
+          </w:p>
+        </w:tc>
+      </w:tr>
+      <w:tr>
+        <w:tc>
+          <w:tcPr>
+            <w:tcW w:type="dxa" w:w="2340"/>
+            <w:vAlign w:val="center"/>
+          </w:tcPr>
+          <w:p>
+            <w:pPr>
+              <w:jc w:val="left"/>
+            </w:pPr>
+            <w:r/>
+            <w:r>
+              <w:rPr>
+                <w:rFonts w:ascii="Calibri" w:hAnsi="Calibri"/>
+                <w:b w:val="0"/>
+                <w:sz w:val="21"/>
+              </w:rPr>
+              <w:t>Garmin</w:t>
+            </w:r>
+          </w:p>
+        </w:tc>
+        <w:tc>
+          <w:tcPr>
+            <w:tcW w:type="dxa" w:w="2340"/>
+            <w:vAlign w:val="center"/>
+          </w:tcPr>
+          <w:p>
+            <w:pPr>
+              <w:jc w:val="left"/>
+            </w:pPr>
+            <w:r/>
+            <w:r>
+              <w:rPr>
+                <w:rFonts w:ascii="Calibri" w:hAnsi="Calibri"/>
+                <w:b w:val="0"/>
+                <w:sz w:val="21"/>
+              </w:rPr>
+              <w:t>Servizi API in migrazione</w:t>
+            </w:r>
+          </w:p>
+        </w:tc>
+        <w:tc>
+          <w:tcPr>
+            <w:tcW w:type="dxa" w:w="2340"/>
+            <w:vAlign w:val="center"/>
+          </w:tcPr>
+          <w:p>
+            <w:pPr>
+              <w:jc w:val="left"/>
+            </w:pPr>
+            <w:r/>
+            <w:r>
+              <w:rPr>
+                <w:rFonts w:ascii="Calibri" w:hAnsi="Calibri"/>
+                <w:b w:val="0"/>
+                <w:sz w:val="21"/>
+              </w:rPr>
+              <w:t>n.d.</w:t>
+            </w:r>
+          </w:p>
+        </w:tc>
+        <w:tc>
+          <w:tcPr>
+            <w:tcW w:type="dxa" w:w="2340"/>
+            <w:vAlign w:val="center"/>
+          </w:tcPr>
+          <w:p>
+            <w:pPr>
+              <w:jc w:val="left"/>
+            </w:pPr>
+            <w:r/>
+            <w:r>
+              <w:rPr>
+                <w:rFonts w:ascii="Calibri" w:hAnsi="Calibri"/>
+                <w:b w:val="0"/>
+                <w:sz w:val="21"/>
+              </w:rPr>
+              <w:t>Attendere ripresa servizi e condizioni Developer Program.</w:t>
+            </w:r>
+          </w:p>
+        </w:tc>
+      </w:tr>
+      <w:tr>
+        <w:tc>
+          <w:tcPr>
+            <w:tcW w:type="dxa" w:w="2340"/>
+            <w:vAlign w:val="center"/>
+          </w:tcPr>
+          <w:p>
+            <w:pPr>
+              <w:jc w:val="left"/>
+            </w:pPr>
+            <w:r/>
+            <w:r>
+              <w:rPr>
+                <w:rFonts w:ascii="Calibri" w:hAnsi="Calibri"/>
+                <w:b w:val="0"/>
+                <w:sz w:val="21"/>
+              </w:rPr>
+              <w:t>adidas Running</w:t>
+            </w:r>
+          </w:p>
+        </w:tc>
+        <w:tc>
+          <w:tcPr>
+            <w:tcW w:type="dxa" w:w="2340"/>
+            <w:vAlign w:val="center"/>
+          </w:tcPr>
+          <w:p>
+            <w:pPr>
+              <w:jc w:val="left"/>
+            </w:pPr>
+            <w:r/>
+            <w:r>
+              <w:rPr>
+                <w:rFonts w:ascii="Calibri" w:hAnsi="Calibri"/>
+                <w:b w:val="0"/>
+                <w:sz w:val="21"/>
+              </w:rPr>
+              <w:t>OAuth/API in standby; export locale disponibile</w:t>
+            </w:r>
+          </w:p>
+        </w:tc>
+        <w:tc>
+          <w:tcPr>
+            <w:tcW w:type="dxa" w:w="2340"/>
+            <w:vAlign w:val="center"/>
+          </w:tcPr>
+          <w:p>
+            <w:pPr>
+              <w:jc w:val="left"/>
+            </w:pPr>
+            <w:r/>
+            <w:r>
+              <w:rPr>
+                <w:rFonts w:ascii="Calibri" w:hAnsi="Calibri"/>
+                <w:b w:val="0"/>
+                <w:sz w:val="21"/>
+              </w:rPr>
+              <w:t>n.d.</w:t>
+            </w:r>
+          </w:p>
+        </w:tc>
+        <w:tc>
+          <w:tcPr>
+            <w:tcW w:type="dxa" w:w="2340"/>
+            <w:vAlign w:val="center"/>
+          </w:tcPr>
+          <w:p>
+            <w:pPr>
+              <w:jc w:val="left"/>
+            </w:pPr>
+            <w:r/>
+            <w:r>
+              <w:rPr>
+                <w:rFonts w:ascii="Calibri" w:hAnsi="Calibri"/>
+                <w:b w:val="0"/>
+                <w:sz w:val="21"/>
+              </w:rPr>
+              <w:t>Mantenere l'export locale come alternativa senza costo API.</w:t>
+            </w:r>
+          </w:p>
+        </w:tc>
+      </w:tr>
+      <w:tr>
+        <w:tc>
+          <w:tcPr>
+            <w:tcW w:type="dxa" w:w="2340"/>
+            <w:vAlign w:val="center"/>
+          </w:tcPr>
+          <w:p>
+            <w:pPr>
+              <w:jc w:val="left"/>
+            </w:pPr>
+            <w:r/>
+            <w:r>
+              <w:rPr>
+                <w:rFonts w:ascii="Calibri" w:hAnsi="Calibri"/>
+                <w:b w:val="0"/>
+                <w:sz w:val="21"/>
+              </w:rPr>
+              <w:t>Inline Route Tracking</w:t>
+            </w:r>
+          </w:p>
+        </w:tc>
+        <w:tc>
+          <w:tcPr>
+            <w:tcW w:type="dxa" w:w="2340"/>
+            <w:vAlign w:val="center"/>
+          </w:tcPr>
+          <w:p>
+            <w:pPr>
+              <w:jc w:val="left"/>
+            </w:pPr>
+            <w:r/>
+            <w:r>
+              <w:rPr>
+                <w:rFonts w:ascii="Calibri" w:hAnsi="Calibri"/>
+                <w:b w:val="0"/>
+                <w:sz w:val="21"/>
+              </w:rPr>
+              <w:t>In attesa API ufficiali</w:t>
+            </w:r>
+          </w:p>
+        </w:tc>
+        <w:tc>
+          <w:tcPr>
+            <w:tcW w:type="dxa" w:w="2340"/>
+            <w:vAlign w:val="center"/>
+          </w:tcPr>
+          <w:p>
+            <w:pPr>
+              <w:jc w:val="left"/>
+            </w:pPr>
+            <w:r/>
+            <w:r>
+              <w:rPr>
+                <w:rFonts w:ascii="Calibri" w:hAnsi="Calibri"/>
+                <w:b w:val="0"/>
+                <w:sz w:val="21"/>
+              </w:rPr>
+              <w:t>n.d.</w:t>
+            </w:r>
+          </w:p>
+        </w:tc>
+        <w:tc>
+          <w:tcPr>
+            <w:tcW w:type="dxa" w:w="2340"/>
+            <w:vAlign w:val="center"/>
+          </w:tcPr>
+          <w:p>
+            <w:pPr>
+              <w:jc w:val="left"/>
+            </w:pPr>
+            <w:r/>
+            <w:r>
+              <w:rPr>
+                <w:rFonts w:ascii="Calibri" w:hAnsi="Calibri"/>
+                <w:b w:val="0"/>
+                <w:sz w:val="21"/>
+              </w:rPr>
+              <w:t>Definire licenza, OAuth e schema dati con il team dell'app.</w:t>
+            </w:r>
+          </w:p>
+        </w:tc>
+      </w:tr>
+    </w:tbl>
+    <w:p>
+      <w:pPr>
+        <w:pStyle w:val="ManualCallout"/>
+      </w:pPr>
+      <w:r>
+        <w:rPr>
+          <w:b/>
+        </w:rPr>
+        <w:t xml:space="preserve">Modello economico previsto: </w:t>
+      </w:r>
+      <w:r>
+        <w:t>funzioni base gratuite e quote Supporter facoltative per coprire VPS, dominio e provider approvati; non vendere accesso a provider finché le rispettive licenze non lo consentono espressamente.</w:t>
+      </w:r>
+    </w:p>
     <w:sectPr>
-      <w:footerReference w:type="default" r:id="rId11"/>
+      <w:footerReference w:type="default" r:id="rId10"/>
       <w:pgSz w:w="12240" w:h="15840"/>
       <w:pgMar w:top="1440" w:right="1440" w:bottom="1440" w:left="1440" w:header="706" w:footer="706" w:gutter="0"/>
       <w:cols w:space="720"/>

</xml_diff>

<commit_message>
feat: add premium payments, provider settings and updated user manual
</commit_message>
<xml_diff>
--- a/artifacts/manuale_utente_street_skate.docx
+++ b/artifacts/manuale_utente_street_skate.docx
@@ -78,7 +78,7 @@
                 <w:b w:val="0"/>
                 <w:sz w:val="21"/>
               </w:rPr>
-              <w:t>4.1</w:t>
+              <w:t>4.9</w:t>
             </w:r>
           </w:p>
         </w:tc>
@@ -121,7 +121,7 @@
                 <w:b w:val="0"/>
                 <w:sz w:val="21"/>
               </w:rPr>
-              <w:t>16/09/2026</w:t>
+              <w:t>29/09/2026</w:t>
             </w:r>
           </w:p>
         </w:tc>
@@ -715,7 +715,7 @@
         <w:pStyle w:val="ListBullet"/>
       </w:pPr>
       <w:r>
-        <w:t>Suunto: il provider e predisposto nel progetto, ma al 19 agosto 2026 la richiesta partnership risulta inviata e in review da parte di Suunto, con finestra indicativa di risposta entro circa il 2 settembre 2026.</w:t>
+        <w:t>Suunto: OAuth e Workout API sono predisposti. La schermata provider mostra Configured solo quando client ID, client secret e subscription key sono disponibili; la conversione FIT completa resta una fase di implementazione successiva.</w:t>
       </w:r>
     </w:p>
     <w:p>
@@ -1179,7 +1179,7 @@
         <w:pStyle w:val="ListBullet"/>
       </w:pPr>
       <w:r>
-        <w:t>Pulsante Supporta: resta inattivo finché Stripe non è configurato con chiave segreta e Price ID; quando disponibile apre una pagina dedicata e avvia un pagamento volontario tramite Stripe Checkout.</w:t>
+        <w:t>Pulsante Supporta: apre sempre Street Skate Premium, associato all'e-mail univoca dell'account autenticato. I singoli pulsanti Stripe e PayPal restano non disponibili finché il relativo provider non è configurato.</w:t>
       </w:r>
     </w:p>
     <w:p>
@@ -1404,6 +1404,62 @@
       </w:pPr>
       <w:r>
         <w:t>Fallback su bounding box o vista iniziale se i punti del tracciato non sono disponibili.</w:t>
+      </w:r>
+    </w:p>
+    <w:p>
+      <w:pPr>
+        <w:pStyle w:val="Heading2"/>
+      </w:pPr>
+      <w:r>
+        <w:t>4.5 Street Skate Premium</w:t>
+      </w:r>
+    </w:p>
+    <w:p>
+      <w:pPr>
+        <w:pStyle w:val="ListBullet"/>
+      </w:pPr>
+      <w:r>
+        <w:t>La pagina Premium mostra l'e-mail registrata dell'account che riceverà il beneficio; nessun pagamento anonimo abilita la versione senza pubblicità.</w:t>
+      </w:r>
+    </w:p>
+    <w:p>
+      <w:pPr>
+        <w:pStyle w:val="ListBullet"/>
+      </w:pPr>
+      <w:r>
+        <w:t>Stripe Checkout crea una sessione con user ID ed e-mail dell'account nei metadati; il backend verifica entrambi al rientro prima di registrare il pagamento.</w:t>
+      </w:r>
+    </w:p>
+    <w:p>
+      <w:pPr>
+        <w:pStyle w:val="ListBullet"/>
+      </w:pPr>
+      <w:r>
+        <w:t>PayPal crea un ordine server-side vincolato al solo user ID autenticato; il backend acquisisce e verifica l'ordine al ritorno da PayPal.</w:t>
+      </w:r>
+    </w:p>
+    <w:p>
+      <w:pPr>
+        <w:pStyle w:val="ListBullet"/>
+      </w:pPr>
+      <w:r>
+        <w:t>Ogni operazione è salvata nella tabella payments con provider, ID esterno, e-mail account, importo, valuta, stato e data di scadenza Premium.</w:t>
+      </w:r>
+    </w:p>
+    <w:p>
+      <w:pPr>
+        <w:pStyle w:val="ListBullet"/>
+      </w:pPr>
+      <w:r>
+        <w:t>Un pagamento confermato abilita Premium senza pubblicità per PREMIUM_DURATION_DAYS, 365 giorni per impostazione predefinita. Le chiavi e gli importi restano disattivati finché non configurati tramite ambiente o Docker secrets.</w:t>
+      </w:r>
+    </w:p>
+    <w:p>
+      <w:pPr>
+        <w:pStyle w:val="ListBullet"/>
+      </w:pPr>
+      <w:r>
+        <w:t>La pagina Premium espone offerta, durata, e-mail account, importi Stripe e PayPal, processo di conferma e consensi obbligatori registrati con la versione PREMIUM_TERMS_VERSION prima dell'avvio del checkout.</w:t>
       </w:r>
     </w:p>
     <w:p>
@@ -2374,7 +2430,7 @@
         <w:pStyle w:val="ListBullet"/>
       </w:pPr>
       <w:r>
-        <w:t>Pulsanti autenticazione provider: pannello admin con checkbox per decidere se ciascun provider OAuth deve essere visibile nella home e se il relativo pulsante deve risultare cliccabile. Il predefinito corrente mostra Strava abilitato e Suunto non cliccabile; gli altri provider sono nascosti e disabilitati.</w:t>
+        <w:t>Pulsanti autenticazione provider: pannello admin con checkbox per decidere se ciascun provider OAuth deve essere visibile nella home e se il relativo pulsante deve risultare cliccabile. Il predefinito corrente mostra adidas Running, Strava, MapMyRun, Suunto, Runkeeper e Garmin Connect visibili e abilitati; Inline Route Tracking resta nascosto e disabilitato in attesa delle API ufficiali.</w:t>
       </w:r>
     </w:p>
     <w:p>
@@ -3849,7 +3905,7 @@
         <w:pStyle w:val="ListNumber"/>
       </w:pPr>
       <w:r>
-        <w:t>Mantenere in sospeso le integrazioni provider non ancora operative o in review, in particolare adidas Running, Garmin, Suunto e Inline Route Tracking, fino alla disponibilità di API o credenziali definitive. La richiesta credenziali MapMyRun e stata inviata: alla ricezione configurare client ID e secret, callback pubblico e test OAuth/workout.</w:t>
+        <w:t>Mantenere in sospeso le integrazioni provider non ancora operative o in review, in particolare adidas Running, Garmin e Inline Route Tracking, fino alla disponibilità di API o credenziali definitive. Per Suunto completare il test OAuth/Workout API e implementare l'import FIT/GPX prima dell'abilitazione agli utenti. La richiesta credenziali MapMyRun e stata inviata: alla ricezione configurare client ID e secret, callback pubblico e test OAuth/workout.</w:t>
       </w:r>
     </w:p>
     <w:p>
@@ -4170,7 +4226,7 @@
                 <w:b w:val="0"/>
                 <w:sz w:val="21"/>
               </w:rPr>
-              <w:t>Partner Program in review</w:t>
+              <w:t>OAuth e Workout API configurabili</w:t>
             </w:r>
           </w:p>
         </w:tc>
@@ -4210,7 +4266,7 @@
                 <w:b w:val="0"/>
                 <w:sz w:val="21"/>
               </w:rPr>
-              <w:t>Attendere esito partnership, condizioni API e costi.</w:t>
+              <w:t>Completare test OAuth e import FIT/GPX prima di abilitarlo agli utenti.</w:t>
             </w:r>
           </w:p>
         </w:tc>

</xml_diff>